<commit_message>
feat: add python scripts and assets to generate formatted KMS project report and documentation
</commit_message>
<xml_diff>
--- a/Horizon-UniStock-Documentation/TUGAS BESAR MATKUL KMS/cover.docx
+++ b/Horizon-UniStock-Documentation/TUGAS BESAR MATKUL KMS/cover.docx
@@ -81,7 +81,7 @@
                             <a:srgbClr val="548ED4"/>
                           </a:solidFill>
                         </wps:spPr>
-                        <wps:bodyPr wrap="square" lIns="0" tIns="0" rIns="0" bIns="0" rtlCol="0">
+                        <wps:bodyPr wrap="none" lIns="0" tIns="0" rIns="0" bIns="0" rtlCol="0">
                           <a:prstTxWarp prst="textNoShape">
                             <a:avLst/>
                           </a:prstTxWarp>
@@ -145,7 +145,7 @@
     <w:p>
       <w:pPr>
         <w:pStyle w:val="Heading1"/>
-        <w:ind w:right="6"/>
+        <w:ind w:right="0" w:left="0" w:firstLine="0"/>
         <w:jc w:val="center"/>
       </w:pPr>
       <w:r>
@@ -161,7 +161,7 @@
       <w:pPr>
         <w:pStyle w:val="BodyText"/>
         <w:spacing w:before="1"/>
-        <w:ind w:left="570" w:right="2"/>
+        <w:ind w:left="0" w:right="0" w:firstLine="0"/>
         <w:jc w:val="center"/>
       </w:pPr>
       <w:r>
@@ -184,14 +184,15 @@
     <w:p>
       <w:pPr>
         <w:pStyle w:val="BodyText"/>
-        <w:ind w:left="720" w:right="154" w:firstLine="2"/>
+        <w:spacing w:before="80" w:after="80"/>
+        <w:ind w:left="0" w:right="0" w:firstLine="0"/>
         <w:jc w:val="center"/>
       </w:pPr>
       <w:r>
         <w:rPr>
           <w:rFonts w:ascii="Times New Roman" w:hAnsi="Times New Roman"/>
           <w:b/>
-          <w:sz w:val="25"/>
+          <w:sz w:val="26"/>
         </w:rPr>
         <w:t>PERANCANGAN KNOWLEDGE MANAGEMENT SYSTEM</w:t>
         <w:br/>
@@ -263,7 +264,7 @@
     <w:p>
       <w:pPr>
         <w:spacing w:before="0"/>
-        <w:ind w:left="570" w:right="1" w:firstLine="0"/>
+        <w:ind w:left="0" w:right="0" w:firstLine="0"/>
         <w:jc w:val="center"/>
         <w:rPr>
           <w:b/>
@@ -283,7 +284,7 @@
       <w:pPr>
         <w:pStyle w:val="BodyText"/>
         <w:spacing w:before="139"/>
-        <w:ind w:left="570"/>
+        <w:ind w:left="0" w:right="0" w:firstLine="0"/>
         <w:jc w:val="center"/>
       </w:pPr>
       <w:r>
@@ -292,7 +293,7 @@
           <w:b/>
           <w:sz w:val="24"/>
         </w:rPr>
-        <w:t>Kelompok VIII Kelas SI-3-A</w:t>
+        <w:t>Kelompok I Kelas SI-3-A</w:t>
       </w:r>
     </w:p>
     <w:p>
@@ -303,11 +304,10 @@
           <w:numId w:val="1"/>
         </w:numPr>
         <w:tabs>
-          <w:tab w:pos="2350" w:val="left" w:leader="none"/>
-          <w:tab w:pos="5194" w:val="left" w:leader="none"/>
+          <w:tab w:pos="5216" w:val="left"/>
         </w:tabs>
-        <w:spacing w:line="240" w:lineRule="auto" w:before="161" w:after="0"/>
-        <w:ind w:left="2350" w:right="0" w:hanging="396"/>
+        <w:spacing w:line="240" w:lineRule="auto" w:before="0" w:after="40"/>
+        <w:ind w:left="2268" w:right="0" w:firstLine="0"/>
         <w:jc w:val="left"/>
         <w:rPr>
           <w:sz w:val="24"/>
@@ -316,11 +316,12 @@
       <w:r>
         <w:rPr>
           <w:rFonts w:ascii="Times New Roman" w:hAnsi="Times New Roman"/>
-          <w:sz w:val="24"/>
-        </w:rPr>
-        <w:t>Budi Pekerti Simarmata</w:t>
+          <w:b w:val="0"/>
+          <w:sz w:val="23"/>
+        </w:rPr>
+        <w:t>1. Fhazar Raffiful Aqyla</w:t>
         <w:tab/>
-        <w:t>(4337855201230001)</w:t>
+        <w:t>(4112757201240021)</w:t>
       </w:r>
     </w:p>
     <w:p>
@@ -331,11 +332,10 @@
           <w:numId w:val="1"/>
         </w:numPr>
         <w:tabs>
-          <w:tab w:pos="2350" w:val="left" w:leader="none"/>
-          <w:tab w:pos="5194" w:val="left" w:leader="none"/>
+          <w:tab w:pos="5216" w:val="left"/>
         </w:tabs>
-        <w:spacing w:line="240" w:lineRule="auto" w:before="138" w:after="0"/>
-        <w:ind w:left="2350" w:right="0" w:hanging="396"/>
+        <w:spacing w:line="240" w:lineRule="auto" w:before="0" w:after="40"/>
+        <w:ind w:left="2268" w:right="0" w:firstLine="0"/>
         <w:jc w:val="left"/>
         <w:rPr>
           <w:sz w:val="24"/>
@@ -344,11 +344,12 @@
       <w:r>
         <w:rPr>
           <w:rFonts w:ascii="Times New Roman" w:hAnsi="Times New Roman"/>
-          <w:sz w:val="24"/>
-        </w:rPr>
-        <w:t>Sopan Dan Santun</w:t>
+          <w:b w:val="0"/>
+          <w:sz w:val="23"/>
+        </w:rPr>
+        <w:t>2. Ferry Noer Hendriawan</w:t>
         <w:tab/>
-        <w:t>(4337855201230002)</w:t>
+        <w:t>(4112757201240055)</w:t>
       </w:r>
     </w:p>
     <w:p>
@@ -359,11 +360,10 @@
           <w:numId w:val="1"/>
         </w:numPr>
         <w:tabs>
-          <w:tab w:pos="2350" w:val="left" w:leader="none"/>
-          <w:tab w:pos="5194" w:val="left" w:leader="none"/>
+          <w:tab w:pos="5216" w:val="left"/>
         </w:tabs>
-        <w:spacing w:line="240" w:lineRule="auto" w:before="138" w:after="0"/>
-        <w:ind w:left="2350" w:right="0" w:hanging="396"/>
+        <w:spacing w:line="240" w:lineRule="auto" w:before="0" w:after="40"/>
+        <w:ind w:left="2268" w:right="0" w:firstLine="0"/>
         <w:jc w:val="left"/>
         <w:rPr>
           <w:sz w:val="24"/>
@@ -372,11 +372,12 @@
       <w:r>
         <w:rPr>
           <w:rFonts w:ascii="Times New Roman" w:hAnsi="Times New Roman"/>
-          <w:sz w:val="24"/>
-        </w:rPr>
-        <w:t>Fhazar Maulana</w:t>
+          <w:b w:val="0"/>
+          <w:sz w:val="23"/>
+        </w:rPr>
+        <w:t>3. Daffa Nazriel Zaildan</w:t>
         <w:tab/>
-        <w:t>(4337855201230003)</w:t>
+        <w:t>(4112757201240051)</w:t>
       </w:r>
     </w:p>
     <w:p>
@@ -387,11 +388,10 @@
           <w:numId w:val="1"/>
         </w:numPr>
         <w:tabs>
-          <w:tab w:pos="2350" w:val="left" w:leader="none"/>
-          <w:tab w:pos="5194" w:val="left" w:leader="none"/>
+          <w:tab w:pos="5216" w:val="left"/>
         </w:tabs>
-        <w:spacing w:line="240" w:lineRule="auto" w:before="138" w:after="0"/>
-        <w:ind w:left="2350" w:right="0" w:hanging="396"/>
+        <w:spacing w:line="240" w:lineRule="auto" w:before="0" w:after="40"/>
+        <w:ind w:left="2268" w:right="0" w:firstLine="0"/>
         <w:jc w:val="left"/>
         <w:rPr>
           <w:sz w:val="24"/>
@@ -400,11 +400,12 @@
       <w:r>
         <w:rPr>
           <w:rFonts w:ascii="Times New Roman" w:hAnsi="Times New Roman"/>
-          <w:sz w:val="24"/>
-        </w:rPr>
-        <w:t>Ahmad Rizky Pratama</w:t>
+          <w:b w:val="0"/>
+          <w:sz w:val="23"/>
+        </w:rPr>
+        <w:t>4. Fadel Rahmadhan</w:t>
         <w:tab/>
-        <w:t>(4337855201230004)</w:t>
+        <w:t>(4112757201240054)</w:t>
       </w:r>
     </w:p>
     <w:p>
@@ -415,11 +416,10 @@
           <w:numId w:val="1"/>
         </w:numPr>
         <w:tabs>
-          <w:tab w:pos="2350" w:val="left" w:leader="none"/>
-          <w:tab w:pos="5194" w:val="left" w:leader="none"/>
+          <w:tab w:pos="5216" w:val="left"/>
         </w:tabs>
-        <w:spacing w:line="240" w:lineRule="auto" w:before="138" w:after="0"/>
-        <w:ind w:left="2350" w:right="0" w:hanging="396"/>
+        <w:spacing w:line="240" w:lineRule="auto" w:before="0" w:after="40"/>
+        <w:ind w:left="2268" w:right="0" w:firstLine="0"/>
         <w:jc w:val="left"/>
         <w:rPr>
           <w:sz w:val="24"/>
@@ -428,21 +428,38 @@
       <w:r>
         <w:rPr>
           <w:rFonts w:ascii="Times New Roman" w:hAnsi="Times New Roman"/>
-          <w:sz w:val="24"/>
-        </w:rPr>
-        <w:t>Siti Nurhaliza</w:t>
+          <w:b w:val="0"/>
+          <w:sz w:val="23"/>
+        </w:rPr>
+        <w:t>5. Hildan Anugrah tamadi Putra</w:t>
         <w:tab/>
-        <w:t>(4337855201230005)</w:t>
-      </w:r>
-    </w:p>
-    <w:p>
-      <w:pPr>
-        <w:pStyle w:val="BodyText"/>
+        <w:t>(4112757201240008)</w:t>
+      </w:r>
+    </w:p>
+    <w:p>
+      <w:pPr>
+        <w:pStyle w:val="BodyText"/>
+        <w:tabs>
+          <w:tab w:pos="5216" w:val="left"/>
+        </w:tabs>
+        <w:spacing w:after="40" w:before="0" w:line="240" w:lineRule="auto"/>
+        <w:ind w:left="2268" w:right="0" w:firstLine="0"/>
+        <w:jc w:val="left"/>
         <w:rPr>
           <w:b w:val="0"/>
           <w:sz w:val="24"/>
         </w:rPr>
       </w:pPr>
+      <w:r>
+        <w:rPr>
+          <w:rFonts w:ascii="Times New Roman" w:hAnsi="Times New Roman"/>
+          <w:b w:val="0"/>
+          <w:sz w:val="23"/>
+        </w:rPr>
+        <w:t>6. Acep Ugan Saputra</w:t>
+        <w:tab/>
+        <w:t>(4112757201240034)</w:t>
+      </w:r>
     </w:p>
     <w:p>
       <w:pPr>
@@ -457,7 +474,7 @@
     <w:p>
       <w:pPr>
         <w:spacing w:before="0"/>
-        <w:ind w:left="570" w:right="3" w:firstLine="0"/>
+        <w:ind w:left="0" w:right="0" w:firstLine="0"/>
         <w:jc w:val="center"/>
         <w:rPr>
           <w:b/>
@@ -502,7 +519,7 @@
       <w:pPr>
         <w:pStyle w:val="BodyText"/>
         <w:spacing w:before="1"/>
-        <w:ind w:left="852" w:firstLine="1088"/>
+        <w:ind w:left="0" w:right="0" w:firstLine="0"/>
         <w:jc w:val="center"/>
       </w:pPr>
       <w:r>
@@ -520,6 +537,7 @@
       <w:pPr>
         <w:pStyle w:val="Heading1"/>
         <w:spacing w:line="411" w:lineRule="exact"/>
+        <w:ind w:left="0" w:right="0" w:firstLine="0"/>
         <w:jc w:val="center"/>
       </w:pPr>
       <w:r>
@@ -535,7 +553,7 @@
       <w:pPr>
         <w:pStyle w:val="BodyText"/>
         <w:spacing w:before="1"/>
-        <w:ind w:left="3433" w:right="2862"/>
+        <w:ind w:left="0" w:right="0" w:firstLine="0"/>
         <w:jc w:val="center"/>
       </w:pPr>
       <w:r>

</xml_diff>